<commit_message>
Made the changes given in the feedback
</commit_message>
<xml_diff>
--- a/documentation/docx/Analisis_del_problema.docx
+++ b/documentation/docx/Analisis_del_problema.docx
@@ -8,6 +8,17 @@
       </w:pPr>
       <w:r>
         <w:t>Análisis del problema</w:t>
+      </w:r>
+    </w:p>
+    <w:p>
+      <w:pPr>
+        <w:spacing w:after="180"/>
+      </w:pPr>
+      <w:r>
+        <w:rPr>
+          <w:i/>
+        </w:rPr>
+        <w:t>Actualización del 13 de septiembre de 2026: el flujo sanguíneo se adelanta al monolito antes de extraer microservicios. Este documento conserva la línea base y los requisitos semestrales; sus fases no describen por sí solas el avance actual. El Reporte Técnico del Primer Avance 2.0 consolida el alcance vigente, las pruebas y los límites. Órganos/HLA y componentes distribuidos permanecen posteriores.</w:t>
       </w:r>
     </w:p>
     <w:tbl>

</xml_diff>